<commit_message>
Renumber paper assets for the 10-page LNCS paper; add supplementary split and page-budget check
Co-Authored-By: Claude Opus 5.5 <noreply@anthropic.com>
Claude-Session: https://claude.ai/code/session_013uWkUTkpShdLpb9w6rB88i
</commit_message>
<xml_diff>
--- a/paper_assets/tables/tables_for_word.docx
+++ b/paper_assets/tables/tables_for_word.docx
@@ -2051,458 +2051,6 @@
           <w:b w:val="0"/>
           <w:sz w:val="18"/>
         </w:rPr>
-        <w:t>Illustrative meaning of each simulated report (+1 / −1; ∅ = no response)</w:t>
-      </w:r>
-    </w:p>
-    <w:tbl>
-      <w:tblPr>
-        <w:tblW w:type="auto" w:w="0"/>
-        <w:jc w:val="center"/>
-        <w:tblLayout w:type="fixed"/>
-        <w:tblLook w:firstColumn="1" w:firstRow="1" w:lastColumn="0" w:lastRow="0" w:noHBand="0" w:noVBand="1" w:val="04A0"/>
-      </w:tblPr>
-      <w:tblGrid>
-        <w:gridCol w:w="964"/>
-        <w:gridCol w:w="1984"/>
-        <w:gridCol w:w="1984"/>
-        <w:gridCol w:w="1984"/>
-      </w:tblGrid>
-      <w:tr>
-        <w:trPr>
-          <w:cantSplit/>
-          <w:tblHeader/>
-        </w:trPr>
-        <w:tc>
-          <w:tcPr>
-            <w:tcW w:type="dxa" w:w="964"/>
-            <w:tcBorders>
-              <w:left w:val="nil" w:sz="0" w:color="000000"/>
-              <w:right w:val="nil" w:sz="0" w:color="000000"/>
-              <w:top w:val="single" w:sz="8" w:color="000000"/>
-              <w:bottom w:val="single" w:sz="4" w:color="000000"/>
-            </w:tcBorders>
-          </w:tcPr>
-          <w:p>
-            <w:pPr>
-              <w:keepNext/>
-              <w:spacing w:before="20" w:after="20"/>
-            </w:pPr>
-            <w:r>
-              <w:rPr>
-                <w:b/>
-                <w:sz w:val="16"/>
-              </w:rPr>
-              <w:t>Office</w:t>
-            </w:r>
-          </w:p>
-        </w:tc>
-        <w:tc>
-          <w:tcPr>
-            <w:tcW w:type="dxa" w:w="1984"/>
-            <w:tcBorders>
-              <w:left w:val="nil" w:sz="0" w:color="000000"/>
-              <w:right w:val="nil" w:sz="0" w:color="000000"/>
-              <w:top w:val="single" w:sz="8" w:color="000000"/>
-              <w:bottom w:val="single" w:sz="4" w:color="000000"/>
-            </w:tcBorders>
-          </w:tcPr>
-          <w:p>
-            <w:pPr>
-              <w:keepNext/>
-              <w:spacing w:before="20" w:after="20"/>
-            </w:pPr>
-            <w:r>
-              <w:rPr>
-                <w:b/>
-                <w:sz w:val="16"/>
-              </w:rPr>
-              <w:t>own: seller is recorded holder</w:t>
-            </w:r>
-          </w:p>
-        </w:tc>
-        <w:tc>
-          <w:tcPr>
-            <w:tcW w:type="dxa" w:w="1984"/>
-            <w:tcBorders>
-              <w:left w:val="nil" w:sz="0" w:color="000000"/>
-              <w:right w:val="nil" w:sz="0" w:color="000000"/>
-              <w:top w:val="single" w:sz="8" w:color="000000"/>
-              <w:bottom w:val="single" w:sz="4" w:color="000000"/>
-            </w:tcBorders>
-          </w:tcPr>
-          <w:p>
-            <w:pPr>
-              <w:keepNext/>
-              <w:spacing w:before="20" w:after="20"/>
-            </w:pPr>
-            <w:r>
-              <w:rPr>
-                <w:b/>
-                <w:sz w:val="16"/>
-              </w:rPr>
-              <w:t>deed: deed registered, matching</w:t>
-            </w:r>
-          </w:p>
-        </w:tc>
-        <w:tc>
-          <w:tcPr>
-            <w:tcW w:type="dxa" w:w="1984"/>
-            <w:tcBorders>
-              <w:left w:val="nil" w:sz="0" w:color="000000"/>
-              <w:right w:val="nil" w:sz="0" w:color="000000"/>
-              <w:top w:val="single" w:sz="8" w:color="000000"/>
-              <w:bottom w:val="single" w:sz="4" w:color="000000"/>
-            </w:tcBorders>
-          </w:tcPr>
-          <w:p>
-            <w:pPr>
-              <w:keepNext/>
-              <w:spacing w:before="20" w:after="20"/>
-            </w:pPr>
-            <w:r>
-              <w:rPr>
-                <w:b/>
-                <w:sz w:val="16"/>
-              </w:rPr>
-              <w:t>restr: no pending proceeding</w:t>
-            </w:r>
-          </w:p>
-        </w:tc>
-      </w:tr>
-      <w:tr>
-        <w:trPr>
-          <w:cantSplit/>
-        </w:trPr>
-        <w:tc>
-          <w:tcPr>
-            <w:tcW w:type="dxa" w:w="964"/>
-            <w:tcBorders>
-              <w:left w:val="nil" w:sz="0" w:color="000000"/>
-              <w:right w:val="nil" w:sz="0" w:color="000000"/>
-              <w:top w:val="nil" w:sz="0" w:color="000000"/>
-              <w:bottom w:val="nil" w:sz="0" w:color="000000"/>
-            </w:tcBorders>
-          </w:tcPr>
-          <w:p>
-            <w:pPr>
-              <w:keepNext/>
-              <w:spacing w:before="20" w:after="20"/>
-            </w:pPr>
-            <w:r>
-              <w:rPr>
-                <w:b w:val="0"/>
-                <w:sz w:val="16"/>
-              </w:rPr>
-              <w:t>Revenue</w:t>
-            </w:r>
-          </w:p>
-        </w:tc>
-        <w:tc>
-          <w:tcPr>
-            <w:tcW w:type="dxa" w:w="1984"/>
-            <w:tcBorders>
-              <w:left w:val="nil" w:sz="0" w:color="000000"/>
-              <w:right w:val="nil" w:sz="0" w:color="000000"/>
-              <w:top w:val="nil" w:sz="0" w:color="000000"/>
-              <w:bottom w:val="nil" w:sz="0" w:color="000000"/>
-            </w:tcBorders>
-          </w:tcPr>
-          <w:p>
-            <w:pPr>
-              <w:keepNext/>
-              <w:spacing w:before="20" w:after="20"/>
-            </w:pPr>
-            <w:r>
-              <w:rPr>
-                <w:b w:val="0"/>
-                <w:sz w:val="16"/>
-              </w:rPr>
-              <w:t>Home. +1 record of rights names the seller; −1 names another</w:t>
-            </w:r>
-          </w:p>
-        </w:tc>
-        <w:tc>
-          <w:tcPr>
-            <w:tcW w:type="dxa" w:w="1984"/>
-            <w:tcBorders>
-              <w:left w:val="nil" w:sz="0" w:color="000000"/>
-              <w:right w:val="nil" w:sz="0" w:color="000000"/>
-              <w:top w:val="nil" w:sz="0" w:color="000000"/>
-              <w:bottom w:val="nil" w:sz="0" w:color="000000"/>
-            </w:tcBorders>
-          </w:tcPr>
-          <w:p>
-            <w:pPr>
-              <w:keepNext/>
-              <w:spacing w:before="20" w:after="20"/>
-            </w:pPr>
-            <w:r>
-              <w:rPr>
-                <w:b w:val="0"/>
-                <w:sz w:val="16"/>
-              </w:rPr>
-              <w:t>+1 mutation file cites a matching deed; −1 no match</w:t>
-            </w:r>
-          </w:p>
-        </w:tc>
-        <w:tc>
-          <w:tcPr>
-            <w:tcW w:type="dxa" w:w="1984"/>
-            <w:tcBorders>
-              <w:left w:val="nil" w:sz="0" w:color="000000"/>
-              <w:right w:val="nil" w:sz="0" w:color="000000"/>
-              <w:top w:val="nil" w:sz="0" w:color="000000"/>
-              <w:bottom w:val="nil" w:sz="0" w:color="000000"/>
-            </w:tcBorders>
-          </w:tcPr>
-          <w:p>
-            <w:pPr>
-              <w:keepNext/>
-              <w:spacing w:before="20" w:after="20"/>
-            </w:pPr>
-            <w:r>
-              <w:rPr>
-                <w:b w:val="0"/>
-                <w:sz w:val="16"/>
-              </w:rPr>
-              <w:t>+1 no pending revenue proceeding noted; −1 one is noted</w:t>
-            </w:r>
-          </w:p>
-        </w:tc>
-      </w:tr>
-      <w:tr>
-        <w:trPr>
-          <w:cantSplit/>
-        </w:trPr>
-        <w:tc>
-          <w:tcPr>
-            <w:tcW w:type="dxa" w:w="964"/>
-            <w:tcBorders>
-              <w:left w:val="nil" w:sz="0" w:color="000000"/>
-              <w:right w:val="nil" w:sz="0" w:color="000000"/>
-              <w:top w:val="nil" w:sz="0" w:color="000000"/>
-              <w:bottom w:val="nil" w:sz="0" w:color="000000"/>
-            </w:tcBorders>
-          </w:tcPr>
-          <w:p>
-            <w:pPr>
-              <w:keepNext/>
-              <w:spacing w:before="20" w:after="20"/>
-            </w:pPr>
-            <w:r>
-              <w:rPr>
-                <w:b w:val="0"/>
-                <w:sz w:val="16"/>
-              </w:rPr>
-              <w:t>Sub-Registrar</w:t>
-            </w:r>
-          </w:p>
-        </w:tc>
-        <w:tc>
-          <w:tcPr>
-            <w:tcW w:type="dxa" w:w="1984"/>
-            <w:tcBorders>
-              <w:left w:val="nil" w:sz="0" w:color="000000"/>
-              <w:right w:val="nil" w:sz="0" w:color="000000"/>
-              <w:top w:val="nil" w:sz="0" w:color="000000"/>
-              <w:bottom w:val="nil" w:sz="0" w:color="000000"/>
-            </w:tcBorders>
-          </w:tcPr>
-          <w:p>
-            <w:pPr>
-              <w:keepNext/>
-              <w:spacing w:before="20" w:after="20"/>
-            </w:pPr>
-            <w:r>
-              <w:rPr>
-                <w:b w:val="0"/>
-                <w:sz w:val="16"/>
-              </w:rPr>
-              <w:t>+1 earlier registered documents consistent with seller; −1 not</w:t>
-            </w:r>
-          </w:p>
-        </w:tc>
-        <w:tc>
-          <w:tcPr>
-            <w:tcW w:type="dxa" w:w="1984"/>
-            <w:tcBorders>
-              <w:left w:val="nil" w:sz="0" w:color="000000"/>
-              <w:right w:val="nil" w:sz="0" w:color="000000"/>
-              <w:top w:val="nil" w:sz="0" w:color="000000"/>
-              <w:bottom w:val="nil" w:sz="0" w:color="000000"/>
-            </w:tcBorders>
-          </w:tcPr>
-          <w:p>
-            <w:pPr>
-              <w:keepNext/>
-              <w:spacing w:before="20" w:after="20"/>
-            </w:pPr>
-            <w:r>
-              <w:rPr>
-                <w:b w:val="0"/>
-                <w:sz w:val="16"/>
-              </w:rPr>
-              <w:t>Home. +1 deed registered, parties and parcel match; −1 not</w:t>
-            </w:r>
-          </w:p>
-        </w:tc>
-        <w:tc>
-          <w:tcPr>
-            <w:tcW w:type="dxa" w:w="1984"/>
-            <w:tcBorders>
-              <w:left w:val="nil" w:sz="0" w:color="000000"/>
-              <w:right w:val="nil" w:sz="0" w:color="000000"/>
-              <w:top w:val="nil" w:sz="0" w:color="000000"/>
-              <w:bottom w:val="nil" w:sz="0" w:color="000000"/>
-            </w:tcBorders>
-          </w:tcPr>
-          <w:p>
-            <w:pPr>
-              <w:keepNext/>
-              <w:spacing w:before="20" w:after="20"/>
-            </w:pPr>
-            <w:r>
-              <w:rPr>
-                <w:b w:val="0"/>
-                <w:sz w:val="16"/>
-              </w:rPr>
-              <w:t>+1 no notice of a pending suit noted; −1 one is noted</w:t>
-            </w:r>
-          </w:p>
-        </w:tc>
-      </w:tr>
-      <w:tr>
-        <w:trPr>
-          <w:cantSplit/>
-        </w:trPr>
-        <w:tc>
-          <w:tcPr>
-            <w:tcW w:type="dxa" w:w="964"/>
-            <w:tcBorders>
-              <w:left w:val="nil" w:sz="0" w:color="000000"/>
-              <w:right w:val="nil" w:sz="0" w:color="000000"/>
-              <w:top w:val="nil" w:sz="0" w:color="000000"/>
-              <w:bottom w:val="single" w:sz="8" w:color="000000"/>
-            </w:tcBorders>
-          </w:tcPr>
-          <w:p>
-            <w:pPr>
-              <w:keepNext w:val="0"/>
-              <w:spacing w:before="20" w:after="20"/>
-            </w:pPr>
-            <w:r>
-              <w:rPr>
-                <w:b w:val="0"/>
-                <w:sz w:val="16"/>
-              </w:rPr>
-              <w:t>Judiciary</w:t>
-            </w:r>
-          </w:p>
-        </w:tc>
-        <w:tc>
-          <w:tcPr>
-            <w:tcW w:type="dxa" w:w="1984"/>
-            <w:tcBorders>
-              <w:left w:val="nil" w:sz="0" w:color="000000"/>
-              <w:right w:val="nil" w:sz="0" w:color="000000"/>
-              <w:top w:val="nil" w:sz="0" w:color="000000"/>
-              <w:bottom w:val="single" w:sz="8" w:color="000000"/>
-            </w:tcBorders>
-          </w:tcPr>
-          <w:p>
-            <w:pPr>
-              <w:keepNext w:val="0"/>
-              <w:spacing w:before="20" w:after="20"/>
-            </w:pPr>
-            <w:r>
-              <w:rPr>
-                <w:b w:val="0"/>
-                <w:sz w:val="16"/>
-              </w:rPr>
-              <w:t>+1 no court record contradicts the holding; −1 a decree names another holder</w:t>
-            </w:r>
-          </w:p>
-        </w:tc>
-        <w:tc>
-          <w:tcPr>
-            <w:tcW w:type="dxa" w:w="1984"/>
-            <w:tcBorders>
-              <w:left w:val="nil" w:sz="0" w:color="000000"/>
-              <w:right w:val="nil" w:sz="0" w:color="000000"/>
-              <w:top w:val="nil" w:sz="0" w:color="000000"/>
-              <w:bottom w:val="single" w:sz="8" w:color="000000"/>
-            </w:tcBorders>
-          </w:tcPr>
-          <w:p>
-            <w:pPr>
-              <w:keepNext w:val="0"/>
-              <w:spacing w:before="20" w:after="20"/>
-            </w:pPr>
-            <w:r>
-              <w:rPr>
-                <w:b w:val="0"/>
-                <w:sz w:val="16"/>
-              </w:rPr>
-              <w:t>+1 no case challenges the deed; −1 one does</w:t>
-            </w:r>
-          </w:p>
-        </w:tc>
-        <w:tc>
-          <w:tcPr>
-            <w:tcW w:type="dxa" w:w="1984"/>
-            <w:tcBorders>
-              <w:left w:val="nil" w:sz="0" w:color="000000"/>
-              <w:right w:val="nil" w:sz="0" w:color="000000"/>
-              <w:top w:val="nil" w:sz="0" w:color="000000"/>
-              <w:bottom w:val="single" w:sz="8" w:color="000000"/>
-            </w:tcBorders>
-          </w:tcPr>
-          <w:p>
-            <w:pPr>
-              <w:keepNext w:val="0"/>
-              <w:spacing w:before="20" w:after="20"/>
-            </w:pPr>
-            <w:r>
-              <w:rPr>
-                <w:b w:val="0"/>
-                <w:sz w:val="16"/>
-              </w:rPr>
-              <w:t>Home. +1 nothing pending in any forum covered; −1 a proceeding is pending</w:t>
-            </w:r>
-          </w:p>
-        </w:tc>
-      </w:tr>
-    </w:tbl>
-    <w:p>
-      <w:pPr>
-        <w:spacing w:before="40"/>
-      </w:pPr>
-      <w:r>
-        <w:rPr>
-          <w:b w:val="0"/>
-          <w:sz w:val="14"/>
-        </w:rPr>
-        <w:t>Simulated signals only; not claims about the records real offices hold or certify.</w:t>
-      </w:r>
-    </w:p>
-    <w:p>
-      <w:pPr>
-        <w:keepNext/>
-        <w:spacing w:before="240" w:after="80"/>
-        <w:jc w:val="center"/>
-      </w:pPr>
-      <w:r>
-        <w:rPr>
-          <w:b/>
-          <w:sz w:val="18"/>
-        </w:rPr>
-        <w:t xml:space="preserve">Table 3. </w:t>
-      </w:r>
-      <w:r>
-        <w:rPr>
-          <w:b w:val="0"/>
-          <w:sz w:val="18"/>
-        </w:rPr>
         <w:t>Claim-specific authority A(i,k) (modelling assumption)</w:t>
       </w:r>
     </w:p>
@@ -2936,7 +2484,7 @@
           <w:b/>
           <w:sz w:val="18"/>
         </w:rPr>
-        <w:t xml:space="preserve">Table 4. </w:t>
+        <w:t xml:space="preserve">Table 3. </w:t>
       </w:r>
       <w:r>
         <w:rPr>
@@ -3743,7 +3291,7 @@
           <w:b/>
           <w:sz w:val="18"/>
         </w:rPr>
-        <w:t xml:space="preserve">Table 5. </w:t>
+        <w:t xml:space="preserve">Table 4. </w:t>
       </w:r>
       <w:r>
         <w:rPr>
@@ -4317,7 +3865,7 @@
           <w:b/>
           <w:sz w:val="18"/>
         </w:rPr>
-        <w:t xml:space="preserve">Table 6. </w:t>
+        <w:t xml:space="preserve">Table 5. </w:t>
       </w:r>
       <w:r>
         <w:rPr>
@@ -5429,7 +4977,7 @@
           <w:b/>
           <w:sz w:val="18"/>
         </w:rPr>
-        <w:t xml:space="preserve">Table 7. </w:t>
+        <w:t xml:space="preserve">Table 6. </w:t>
       </w:r>
       <w:r>
         <w:rPr>
@@ -6587,7 +6135,7 @@
           <w:b/>
           <w:sz w:val="18"/>
         </w:rPr>
-        <w:t xml:space="preserve">Table 8. </w:t>
+        <w:t xml:space="preserve">Table 7. </w:t>
       </w:r>
       <w:r>
         <w:rPr>
@@ -7978,750 +7526,7 @@
           <w:b/>
           <w:sz w:val="18"/>
         </w:rPr>
-        <w:t xml:space="preserve">Table 9. </w:t>
-      </w:r>
-      <w:r>
-        <w:rPr>
-          <w:b w:val="0"/>
-          <w:sz w:val="18"/>
-        </w:rPr>
-        <w:t>Exploratory coverage-gate ablation A1 (paired 95% CIs, 100 seeds, percentage points)</w:t>
-      </w:r>
-    </w:p>
-    <w:tbl>
-      <w:tblPr>
-        <w:tblW w:type="auto" w:w="0"/>
-        <w:jc w:val="center"/>
-        <w:tblLayout w:type="fixed"/>
-        <w:tblLook w:firstColumn="1" w:firstRow="1" w:lastColumn="0" w:lastRow="0" w:noHBand="0" w:noVBand="1" w:val="04A0"/>
-      </w:tblPr>
-      <w:tblGrid>
-        <w:gridCol w:w="2948"/>
-        <w:gridCol w:w="794"/>
-        <w:gridCol w:w="1587"/>
-        <w:gridCol w:w="1587"/>
-      </w:tblGrid>
-      <w:tr>
-        <w:trPr>
-          <w:cantSplit/>
-          <w:tblHeader/>
-        </w:trPr>
-        <w:tc>
-          <w:tcPr>
-            <w:tcW w:type="dxa" w:w="2948"/>
-            <w:tcBorders>
-              <w:left w:val="nil" w:sz="0" w:color="000000"/>
-              <w:right w:val="nil" w:sz="0" w:color="000000"/>
-              <w:top w:val="single" w:sz="8" w:color="000000"/>
-              <w:bottom w:val="single" w:sz="4" w:color="000000"/>
-            </w:tcBorders>
-          </w:tcPr>
-          <w:p>
-            <w:pPr>
-              <w:keepNext/>
-              <w:spacing w:before="20" w:after="20"/>
-            </w:pPr>
-            <w:r>
-              <w:rPr>
-                <w:b/>
-                <w:sz w:val="16"/>
-              </w:rPr>
-              <w:t>Comparison</w:t>
-            </w:r>
-          </w:p>
-        </w:tc>
-        <w:tc>
-          <w:tcPr>
-            <w:tcW w:type="dxa" w:w="794"/>
-            <w:tcBorders>
-              <w:left w:val="nil" w:sz="0" w:color="000000"/>
-              <w:right w:val="nil" w:sz="0" w:color="000000"/>
-              <w:top w:val="single" w:sz="8" w:color="000000"/>
-              <w:bottom w:val="single" w:sz="4" w:color="000000"/>
-            </w:tcBorders>
-          </w:tcPr>
-          <w:p>
-            <w:pPr>
-              <w:keepNext/>
-              <w:spacing w:before="20" w:after="20"/>
-            </w:pPr>
-            <w:r>
-              <w:rPr>
-                <w:b/>
-                <w:sz w:val="16"/>
-              </w:rPr>
-              <w:t>Scenario</w:t>
-            </w:r>
-          </w:p>
-        </w:tc>
-        <w:tc>
-          <w:tcPr>
-            <w:tcW w:type="dxa" w:w="1587"/>
-            <w:tcBorders>
-              <w:left w:val="nil" w:sz="0" w:color="000000"/>
-              <w:right w:val="nil" w:sz="0" w:color="000000"/>
-              <w:top w:val="single" w:sz="8" w:color="000000"/>
-              <w:bottom w:val="single" w:sz="4" w:color="000000"/>
-            </w:tcBorders>
-          </w:tcPr>
-          <w:p>
-            <w:pPr>
-              <w:keepNext/>
-              <w:spacing w:before="20" w:after="20"/>
-            </w:pPr>
-            <w:r>
-              <w:rPr>
-                <w:b/>
-                <w:sz w:val="16"/>
-              </w:rPr>
-              <w:t>FCR difference</w:t>
-            </w:r>
-          </w:p>
-        </w:tc>
-        <w:tc>
-          <w:tcPr>
-            <w:tcW w:type="dxa" w:w="1587"/>
-            <w:tcBorders>
-              <w:left w:val="nil" w:sz="0" w:color="000000"/>
-              <w:right w:val="nil" w:sz="0" w:color="000000"/>
-              <w:top w:val="single" w:sz="8" w:color="000000"/>
-              <w:bottom w:val="single" w:sz="4" w:color="000000"/>
-            </w:tcBorders>
-          </w:tcPr>
-          <w:p>
-            <w:pPr>
-              <w:keepNext/>
-              <w:spacing w:before="20" w:after="20"/>
-            </w:pPr>
-            <w:r>
-              <w:rPr>
-                <w:b/>
-                <w:sz w:val="16"/>
-              </w:rPr>
-              <w:t>VCC difference</w:t>
-            </w:r>
-          </w:p>
-        </w:tc>
-      </w:tr>
-      <w:tr>
-        <w:trPr>
-          <w:cantSplit/>
-        </w:trPr>
-        <w:tc>
-          <w:tcPr>
-            <w:tcW w:type="dxa" w:w="2948"/>
-            <w:tcBorders>
-              <w:left w:val="nil" w:sz="0" w:color="000000"/>
-              <w:right w:val="nil" w:sz="0" w:color="000000"/>
-              <w:top w:val="nil" w:sz="0" w:color="000000"/>
-              <w:bottom w:val="nil" w:sz="0" w:color="000000"/>
-            </w:tcBorders>
-          </w:tcPr>
-          <w:p>
-            <w:pPr>
-              <w:keepNext/>
-              <w:spacing w:before="20" w:after="20"/>
-            </w:pPr>
-            <w:r>
-              <w:rPr>
-                <w:b w:val="0"/>
-                <w:sz w:val="16"/>
-              </w:rPr>
-              <w:t>Hybrid − majority, no gate (G0)</w:t>
-            </w:r>
-          </w:p>
-        </w:tc>
-        <w:tc>
-          <w:tcPr>
-            <w:tcW w:type="dxa" w:w="794"/>
-            <w:tcBorders>
-              <w:left w:val="nil" w:sz="0" w:color="000000"/>
-              <w:right w:val="nil" w:sz="0" w:color="000000"/>
-              <w:top w:val="nil" w:sz="0" w:color="000000"/>
-              <w:bottom w:val="nil" w:sz="0" w:color="000000"/>
-            </w:tcBorders>
-          </w:tcPr>
-          <w:p>
-            <w:pPr>
-              <w:keepNext/>
-              <w:spacing w:before="20" w:after="20"/>
-            </w:pPr>
-            <w:r>
-              <w:rPr>
-                <w:b w:val="0"/>
-                <w:sz w:val="16"/>
-              </w:rPr>
-              <w:t>S1</w:t>
-            </w:r>
-          </w:p>
-        </w:tc>
-        <w:tc>
-          <w:tcPr>
-            <w:tcW w:type="dxa" w:w="1587"/>
-            <w:tcBorders>
-              <w:left w:val="nil" w:sz="0" w:color="000000"/>
-              <w:right w:val="nil" w:sz="0" w:color="000000"/>
-              <w:top w:val="nil" w:sz="0" w:color="000000"/>
-              <w:bottom w:val="nil" w:sz="0" w:color="000000"/>
-            </w:tcBorders>
-          </w:tcPr>
-          <w:p>
-            <w:pPr>
-              <w:keepNext/>
-              <w:spacing w:before="20" w:after="20"/>
-            </w:pPr>
-            <w:r>
-              <w:rPr>
-                <w:b w:val="0"/>
-                <w:sz w:val="16"/>
-              </w:rPr>
-              <w:t>−1.85 [−2.00, −1.69]</w:t>
-            </w:r>
-          </w:p>
-        </w:tc>
-        <w:tc>
-          <w:tcPr>
-            <w:tcW w:type="dxa" w:w="1587"/>
-            <w:tcBorders>
-              <w:left w:val="nil" w:sz="0" w:color="000000"/>
-              <w:right w:val="nil" w:sz="0" w:color="000000"/>
-              <w:top w:val="nil" w:sz="0" w:color="000000"/>
-              <w:bottom w:val="nil" w:sz="0" w:color="000000"/>
-            </w:tcBorders>
-          </w:tcPr>
-          <w:p>
-            <w:pPr>
-              <w:keepNext/>
-              <w:spacing w:before="20" w:after="20"/>
-            </w:pPr>
-            <w:r>
-              <w:rPr>
-                <w:b w:val="0"/>
-                <w:sz w:val="16"/>
-              </w:rPr>
-              <w:t>−0.27 [−0.53, −0.004]</w:t>
-            </w:r>
-          </w:p>
-        </w:tc>
-      </w:tr>
-      <w:tr>
-        <w:trPr>
-          <w:cantSplit/>
-        </w:trPr>
-        <w:tc>
-          <w:tcPr>
-            <w:tcW w:type="dxa" w:w="2948"/>
-            <w:tcBorders>
-              <w:left w:val="nil" w:sz="0" w:color="000000"/>
-              <w:right w:val="nil" w:sz="0" w:color="000000"/>
-              <w:top w:val="nil" w:sz="0" w:color="000000"/>
-              <w:bottom w:val="nil" w:sz="0" w:color="000000"/>
-            </w:tcBorders>
-          </w:tcPr>
-          <w:p>
-            <w:pPr>
-              <w:keepNext/>
-              <w:spacing w:before="20" w:after="20"/>
-            </w:pPr>
-            <w:r>
-              <w:rPr>
-                <w:b w:val="0"/>
-                <w:sz w:val="16"/>
-              </w:rPr>
-              <w:t>Hybrid − majority, no gate (G0)</w:t>
-            </w:r>
-          </w:p>
-        </w:tc>
-        <w:tc>
-          <w:tcPr>
-            <w:tcW w:type="dxa" w:w="794"/>
-            <w:tcBorders>
-              <w:left w:val="nil" w:sz="0" w:color="000000"/>
-              <w:right w:val="nil" w:sz="0" w:color="000000"/>
-              <w:top w:val="nil" w:sz="0" w:color="000000"/>
-              <w:bottom w:val="nil" w:sz="0" w:color="000000"/>
-            </w:tcBorders>
-          </w:tcPr>
-          <w:p>
-            <w:pPr>
-              <w:keepNext/>
-              <w:spacing w:before="20" w:after="20"/>
-            </w:pPr>
-            <w:r>
-              <w:rPr>
-                <w:b w:val="0"/>
-                <w:sz w:val="16"/>
-              </w:rPr>
-              <w:t>S4</w:t>
-            </w:r>
-          </w:p>
-        </w:tc>
-        <w:tc>
-          <w:tcPr>
-            <w:tcW w:type="dxa" w:w="1587"/>
-            <w:tcBorders>
-              <w:left w:val="nil" w:sz="0" w:color="000000"/>
-              <w:right w:val="nil" w:sz="0" w:color="000000"/>
-              <w:top w:val="nil" w:sz="0" w:color="000000"/>
-              <w:bottom w:val="nil" w:sz="0" w:color="000000"/>
-            </w:tcBorders>
-          </w:tcPr>
-          <w:p>
-            <w:pPr>
-              <w:keepNext/>
-              <w:spacing w:before="20" w:after="20"/>
-            </w:pPr>
-            <w:r>
-              <w:rPr>
-                <w:b w:val="0"/>
-                <w:sz w:val="16"/>
-              </w:rPr>
-              <w:t>−0.99 [−1.14, −0.83]</w:t>
-            </w:r>
-          </w:p>
-        </w:tc>
-        <w:tc>
-          <w:tcPr>
-            <w:tcW w:type="dxa" w:w="1587"/>
-            <w:tcBorders>
-              <w:left w:val="nil" w:sz="0" w:color="000000"/>
-              <w:right w:val="nil" w:sz="0" w:color="000000"/>
-              <w:top w:val="nil" w:sz="0" w:color="000000"/>
-              <w:bottom w:val="nil" w:sz="0" w:color="000000"/>
-            </w:tcBorders>
-          </w:tcPr>
-          <w:p>
-            <w:pPr>
-              <w:keepNext/>
-              <w:spacing w:before="20" w:after="20"/>
-            </w:pPr>
-            <w:r>
-              <w:rPr>
-                <w:b w:val="0"/>
-                <w:sz w:val="16"/>
-              </w:rPr>
-              <w:t>+8.41 [+8.13, +8.70]</w:t>
-            </w:r>
-          </w:p>
-        </w:tc>
-      </w:tr>
-      <w:tr>
-        <w:trPr>
-          <w:cantSplit/>
-        </w:trPr>
-        <w:tc>
-          <w:tcPr>
-            <w:tcW w:type="dxa" w:w="2948"/>
-            <w:tcBorders>
-              <w:left w:val="nil" w:sz="0" w:color="000000"/>
-              <w:right w:val="nil" w:sz="0" w:color="000000"/>
-              <w:top w:val="nil" w:sz="0" w:color="000000"/>
-              <w:bottom w:val="nil" w:sz="0" w:color="000000"/>
-            </w:tcBorders>
-          </w:tcPr>
-          <w:p>
-            <w:pPr>
-              <w:keepNext/>
-              <w:spacing w:before="20" w:after="20"/>
-            </w:pPr>
-            <w:r>
-              <w:rPr>
-                <w:b w:val="0"/>
-                <w:sz w:val="16"/>
-              </w:rPr>
-              <w:t>Hybrid − majority, common count gate (G1)</w:t>
-            </w:r>
-          </w:p>
-        </w:tc>
-        <w:tc>
-          <w:tcPr>
-            <w:tcW w:type="dxa" w:w="794"/>
-            <w:tcBorders>
-              <w:left w:val="nil" w:sz="0" w:color="000000"/>
-              <w:right w:val="nil" w:sz="0" w:color="000000"/>
-              <w:top w:val="nil" w:sz="0" w:color="000000"/>
-              <w:bottom w:val="nil" w:sz="0" w:color="000000"/>
-            </w:tcBorders>
-          </w:tcPr>
-          <w:p>
-            <w:pPr>
-              <w:keepNext/>
-              <w:spacing w:before="20" w:after="20"/>
-            </w:pPr>
-            <w:r>
-              <w:rPr>
-                <w:b w:val="0"/>
-                <w:sz w:val="16"/>
-              </w:rPr>
-              <w:t>S1</w:t>
-            </w:r>
-          </w:p>
-        </w:tc>
-        <w:tc>
-          <w:tcPr>
-            <w:tcW w:type="dxa" w:w="1587"/>
-            <w:tcBorders>
-              <w:left w:val="nil" w:sz="0" w:color="000000"/>
-              <w:right w:val="nil" w:sz="0" w:color="000000"/>
-              <w:top w:val="nil" w:sz="0" w:color="000000"/>
-              <w:bottom w:val="nil" w:sz="0" w:color="000000"/>
-            </w:tcBorders>
-          </w:tcPr>
-          <w:p>
-            <w:pPr>
-              <w:keepNext/>
-              <w:spacing w:before="20" w:after="20"/>
-            </w:pPr>
-            <w:r>
-              <w:rPr>
-                <w:b w:val="0"/>
-                <w:sz w:val="16"/>
-              </w:rPr>
-              <w:t>−1.85 [−2.01, −1.70]</w:t>
-            </w:r>
-          </w:p>
-        </w:tc>
-        <w:tc>
-          <w:tcPr>
-            <w:tcW w:type="dxa" w:w="1587"/>
-            <w:tcBorders>
-              <w:left w:val="nil" w:sz="0" w:color="000000"/>
-              <w:right w:val="nil" w:sz="0" w:color="000000"/>
-              <w:top w:val="nil" w:sz="0" w:color="000000"/>
-              <w:bottom w:val="nil" w:sz="0" w:color="000000"/>
-            </w:tcBorders>
-          </w:tcPr>
-          <w:p>
-            <w:pPr>
-              <w:keepNext/>
-              <w:spacing w:before="20" w:after="20"/>
-            </w:pPr>
-            <w:r>
-              <w:rPr>
-                <w:b w:val="0"/>
-                <w:sz w:val="16"/>
-              </w:rPr>
-              <w:t>−0.27 [−0.53, −0.004]</w:t>
-            </w:r>
-          </w:p>
-        </w:tc>
-      </w:tr>
-      <w:tr>
-        <w:trPr>
-          <w:cantSplit/>
-        </w:trPr>
-        <w:tc>
-          <w:tcPr>
-            <w:tcW w:type="dxa" w:w="2948"/>
-            <w:tcBorders>
-              <w:left w:val="nil" w:sz="0" w:color="000000"/>
-              <w:right w:val="nil" w:sz="0" w:color="000000"/>
-              <w:top w:val="nil" w:sz="0" w:color="000000"/>
-              <w:bottom w:val="nil" w:sz="0" w:color="000000"/>
-            </w:tcBorders>
-          </w:tcPr>
-          <w:p>
-            <w:pPr>
-              <w:keepNext/>
-              <w:spacing w:before="20" w:after="20"/>
-            </w:pPr>
-            <w:r>
-              <w:rPr>
-                <w:b w:val="0"/>
-                <w:sz w:val="16"/>
-              </w:rPr>
-              <w:t>Hybrid − majority, common count gate (G1)</w:t>
-            </w:r>
-          </w:p>
-        </w:tc>
-        <w:tc>
-          <w:tcPr>
-            <w:tcW w:type="dxa" w:w="794"/>
-            <w:tcBorders>
-              <w:left w:val="nil" w:sz="0" w:color="000000"/>
-              <w:right w:val="nil" w:sz="0" w:color="000000"/>
-              <w:top w:val="nil" w:sz="0" w:color="000000"/>
-              <w:bottom w:val="nil" w:sz="0" w:color="000000"/>
-            </w:tcBorders>
-          </w:tcPr>
-          <w:p>
-            <w:pPr>
-              <w:keepNext/>
-              <w:spacing w:before="20" w:after="20"/>
-            </w:pPr>
-            <w:r>
-              <w:rPr>
-                <w:b w:val="0"/>
-                <w:sz w:val="16"/>
-              </w:rPr>
-              <w:t>S4</w:t>
-            </w:r>
-          </w:p>
-        </w:tc>
-        <w:tc>
-          <w:tcPr>
-            <w:tcW w:type="dxa" w:w="1587"/>
-            <w:tcBorders>
-              <w:left w:val="nil" w:sz="0" w:color="000000"/>
-              <w:right w:val="nil" w:sz="0" w:color="000000"/>
-              <w:top w:val="nil" w:sz="0" w:color="000000"/>
-              <w:bottom w:val="nil" w:sz="0" w:color="000000"/>
-            </w:tcBorders>
-          </w:tcPr>
-          <w:p>
-            <w:pPr>
-              <w:keepNext/>
-              <w:spacing w:before="20" w:after="20"/>
-            </w:pPr>
-            <w:r>
-              <w:rPr>
-                <w:b w:val="0"/>
-                <w:sz w:val="16"/>
-              </w:rPr>
-              <w:t>−1.01 [−1.19, −0.83]</w:t>
-            </w:r>
-          </w:p>
-        </w:tc>
-        <w:tc>
-          <w:tcPr>
-            <w:tcW w:type="dxa" w:w="1587"/>
-            <w:tcBorders>
-              <w:left w:val="nil" w:sz="0" w:color="000000"/>
-              <w:right w:val="nil" w:sz="0" w:color="000000"/>
-              <w:top w:val="nil" w:sz="0" w:color="000000"/>
-              <w:bottom w:val="nil" w:sz="0" w:color="000000"/>
-            </w:tcBorders>
-          </w:tcPr>
-          <w:p>
-            <w:pPr>
-              <w:keepNext/>
-              <w:spacing w:before="20" w:after="20"/>
-            </w:pPr>
-            <w:r>
-              <w:rPr>
-                <w:b w:val="0"/>
-                <w:sz w:val="16"/>
-              </w:rPr>
-              <w:t>+8.41 [+8.13, +8.70]</w:t>
-            </w:r>
-          </w:p>
-        </w:tc>
-      </w:tr>
-      <w:tr>
-        <w:trPr>
-          <w:cantSplit/>
-        </w:trPr>
-        <w:tc>
-          <w:tcPr>
-            <w:tcW w:type="dxa" w:w="2948"/>
-            <w:tcBorders>
-              <w:left w:val="nil" w:sz="0" w:color="000000"/>
-              <w:right w:val="nil" w:sz="0" w:color="000000"/>
-              <w:top w:val="nil" w:sz="0" w:color="000000"/>
-              <w:bottom w:val="nil" w:sz="0" w:color="000000"/>
-            </w:tcBorders>
-          </w:tcPr>
-          <w:p>
-            <w:pPr>
-              <w:keepNext/>
-              <w:spacing w:before="20" w:after="20"/>
-            </w:pPr>
-            <w:r>
-              <w:rPr>
-                <w:b w:val="0"/>
-                <w:sz w:val="16"/>
-              </w:rPr>
-              <w:t>Hybrid: weighted gate − count gate</w:t>
-            </w:r>
-          </w:p>
-        </w:tc>
-        <w:tc>
-          <w:tcPr>
-            <w:tcW w:type="dxa" w:w="794"/>
-            <w:tcBorders>
-              <w:left w:val="nil" w:sz="0" w:color="000000"/>
-              <w:right w:val="nil" w:sz="0" w:color="000000"/>
-              <w:top w:val="nil" w:sz="0" w:color="000000"/>
-              <w:bottom w:val="nil" w:sz="0" w:color="000000"/>
-            </w:tcBorders>
-          </w:tcPr>
-          <w:p>
-            <w:pPr>
-              <w:keepNext/>
-              <w:spacing w:before="20" w:after="20"/>
-            </w:pPr>
-            <w:r>
-              <w:rPr>
-                <w:b w:val="0"/>
-                <w:sz w:val="16"/>
-              </w:rPr>
-              <w:t>S1</w:t>
-            </w:r>
-          </w:p>
-        </w:tc>
-        <w:tc>
-          <w:tcPr>
-            <w:tcW w:type="dxa" w:w="1587"/>
-            <w:tcBorders>
-              <w:left w:val="nil" w:sz="0" w:color="000000"/>
-              <w:right w:val="nil" w:sz="0" w:color="000000"/>
-              <w:top w:val="nil" w:sz="0" w:color="000000"/>
-              <w:bottom w:val="nil" w:sz="0" w:color="000000"/>
-            </w:tcBorders>
-          </w:tcPr>
-          <w:p>
-            <w:pPr>
-              <w:keepNext/>
-              <w:spacing w:before="20" w:after="20"/>
-            </w:pPr>
-            <w:r>
-              <w:rPr>
-                <w:b w:val="0"/>
-                <w:sz w:val="16"/>
-              </w:rPr>
-              <w:t>−0.11 [−0.15, −0.07]</w:t>
-            </w:r>
-          </w:p>
-        </w:tc>
-        <w:tc>
-          <w:tcPr>
-            <w:tcW w:type="dxa" w:w="1587"/>
-            <w:tcBorders>
-              <w:left w:val="nil" w:sz="0" w:color="000000"/>
-              <w:right w:val="nil" w:sz="0" w:color="000000"/>
-              <w:top w:val="nil" w:sz="0" w:color="000000"/>
-              <w:bottom w:val="nil" w:sz="0" w:color="000000"/>
-            </w:tcBorders>
-          </w:tcPr>
-          <w:p>
-            <w:pPr>
-              <w:keepNext/>
-              <w:spacing w:before="20" w:after="20"/>
-            </w:pPr>
-            <w:r>
-              <w:rPr>
-                <w:b w:val="0"/>
-                <w:sz w:val="16"/>
-              </w:rPr>
-              <w:t>−4.25 [−4.39, −4.11]</w:t>
-            </w:r>
-          </w:p>
-        </w:tc>
-      </w:tr>
-      <w:tr>
-        <w:trPr>
-          <w:cantSplit/>
-        </w:trPr>
-        <w:tc>
-          <w:tcPr>
-            <w:tcW w:type="dxa" w:w="2948"/>
-            <w:tcBorders>
-              <w:left w:val="nil" w:sz="0" w:color="000000"/>
-              <w:right w:val="nil" w:sz="0" w:color="000000"/>
-              <w:top w:val="nil" w:sz="0" w:color="000000"/>
-              <w:bottom w:val="single" w:sz="8" w:color="000000"/>
-            </w:tcBorders>
-          </w:tcPr>
-          <w:p>
-            <w:pPr>
-              <w:keepNext w:val="0"/>
-              <w:spacing w:before="20" w:after="20"/>
-            </w:pPr>
-            <w:r>
-              <w:rPr>
-                <w:b w:val="0"/>
-                <w:sz w:val="16"/>
-              </w:rPr>
-              <w:t>Hybrid: weighted gate − count gate</w:t>
-            </w:r>
-          </w:p>
-        </w:tc>
-        <w:tc>
-          <w:tcPr>
-            <w:tcW w:type="dxa" w:w="794"/>
-            <w:tcBorders>
-              <w:left w:val="nil" w:sz="0" w:color="000000"/>
-              <w:right w:val="nil" w:sz="0" w:color="000000"/>
-              <w:top w:val="nil" w:sz="0" w:color="000000"/>
-              <w:bottom w:val="single" w:sz="8" w:color="000000"/>
-            </w:tcBorders>
-          </w:tcPr>
-          <w:p>
-            <w:pPr>
-              <w:keepNext w:val="0"/>
-              <w:spacing w:before="20" w:after="20"/>
-            </w:pPr>
-            <w:r>
-              <w:rPr>
-                <w:b w:val="0"/>
-                <w:sz w:val="16"/>
-              </w:rPr>
-              <w:t>S4</w:t>
-            </w:r>
-          </w:p>
-        </w:tc>
-        <w:tc>
-          <w:tcPr>
-            <w:tcW w:type="dxa" w:w="1587"/>
-            <w:tcBorders>
-              <w:left w:val="nil" w:sz="0" w:color="000000"/>
-              <w:right w:val="nil" w:sz="0" w:color="000000"/>
-              <w:top w:val="nil" w:sz="0" w:color="000000"/>
-              <w:bottom w:val="single" w:sz="8" w:color="000000"/>
-            </w:tcBorders>
-          </w:tcPr>
-          <w:p>
-            <w:pPr>
-              <w:keepNext w:val="0"/>
-              <w:spacing w:before="20" w:after="20"/>
-            </w:pPr>
-            <w:r>
-              <w:rPr>
-                <w:b w:val="0"/>
-                <w:sz w:val="16"/>
-              </w:rPr>
-              <w:t>−0.72 [−0.85, −0.60]</w:t>
-            </w:r>
-          </w:p>
-        </w:tc>
-        <w:tc>
-          <w:tcPr>
-            <w:tcW w:type="dxa" w:w="1587"/>
-            <w:tcBorders>
-              <w:left w:val="nil" w:sz="0" w:color="000000"/>
-              <w:right w:val="nil" w:sz="0" w:color="000000"/>
-              <w:top w:val="nil" w:sz="0" w:color="000000"/>
-              <w:bottom w:val="single" w:sz="8" w:color="000000"/>
-            </w:tcBorders>
-          </w:tcPr>
-          <w:p>
-            <w:pPr>
-              <w:keepNext w:val="0"/>
-              <w:spacing w:before="20" w:after="20"/>
-            </w:pPr>
-            <w:r>
-              <w:rPr>
-                <w:b w:val="0"/>
-                <w:sz w:val="16"/>
-              </w:rPr>
-              <w:t>−21.23 [−21.52, −20.95]</w:t>
-            </w:r>
-          </w:p>
-        </w:tc>
-      </w:tr>
-    </w:tbl>
-    <w:p>
-      <w:pPr>
-        <w:keepNext/>
-        <w:spacing w:before="240" w:after="80"/>
-        <w:jc w:val="center"/>
-      </w:pPr>
-      <w:r>
-        <w:rPr>
-          <w:b/>
-          <w:sz w:val="18"/>
-        </w:rPr>
-        <w:t xml:space="preserve">Table 10. </w:t>
+        <w:t xml:space="preserve">Table 8. </w:t>
       </w:r>
       <w:r>
         <w:rPr>
@@ -9654,6 +8459,14 @@
       </w:r>
     </w:p>
     <w:p>
+      <w:r>
+        <w:rPr>
+          <w:b/>
+        </w:rPr>
+        <w:t>Supplementary tables (not counted in the 10 pages)</w:t>
+      </w:r>
+    </w:p>
+    <w:p>
       <w:pPr>
         <w:keepNext/>
         <w:spacing w:before="240" w:after="80"/>
@@ -9664,7 +8477,1202 @@
           <w:b/>
           <w:sz w:val="18"/>
         </w:rPr>
-        <w:t xml:space="preserve">Table 11. </w:t>
+        <w:t xml:space="preserve">Table S1. </w:t>
+      </w:r>
+      <w:r>
+        <w:rPr>
+          <w:b w:val="0"/>
+          <w:sz w:val="18"/>
+        </w:rPr>
+        <w:t>Illustrative meaning of each simulated report (+1 / −1; ∅ = no response)</w:t>
+      </w:r>
+    </w:p>
+    <w:tbl>
+      <w:tblPr>
+        <w:tblW w:type="auto" w:w="0"/>
+        <w:jc w:val="center"/>
+        <w:tblLayout w:type="fixed"/>
+        <w:tblLook w:firstColumn="1" w:firstRow="1" w:lastColumn="0" w:lastRow="0" w:noHBand="0" w:noVBand="1" w:val="04A0"/>
+      </w:tblPr>
+      <w:tblGrid>
+        <w:gridCol w:w="964"/>
+        <w:gridCol w:w="1984"/>
+        <w:gridCol w:w="1984"/>
+        <w:gridCol w:w="1984"/>
+      </w:tblGrid>
+      <w:tr>
+        <w:trPr>
+          <w:cantSplit/>
+          <w:tblHeader/>
+        </w:trPr>
+        <w:tc>
+          <w:tcPr>
+            <w:tcW w:type="dxa" w:w="964"/>
+            <w:tcBorders>
+              <w:left w:val="nil" w:sz="0" w:color="000000"/>
+              <w:right w:val="nil" w:sz="0" w:color="000000"/>
+              <w:top w:val="single" w:sz="8" w:color="000000"/>
+              <w:bottom w:val="single" w:sz="4" w:color="000000"/>
+            </w:tcBorders>
+          </w:tcPr>
+          <w:p>
+            <w:pPr>
+              <w:keepNext/>
+              <w:spacing w:before="20" w:after="20"/>
+            </w:pPr>
+            <w:r>
+              <w:rPr>
+                <w:b/>
+                <w:sz w:val="16"/>
+              </w:rPr>
+              <w:t>Office</w:t>
+            </w:r>
+          </w:p>
+        </w:tc>
+        <w:tc>
+          <w:tcPr>
+            <w:tcW w:type="dxa" w:w="1984"/>
+            <w:tcBorders>
+              <w:left w:val="nil" w:sz="0" w:color="000000"/>
+              <w:right w:val="nil" w:sz="0" w:color="000000"/>
+              <w:top w:val="single" w:sz="8" w:color="000000"/>
+              <w:bottom w:val="single" w:sz="4" w:color="000000"/>
+            </w:tcBorders>
+          </w:tcPr>
+          <w:p>
+            <w:pPr>
+              <w:keepNext/>
+              <w:spacing w:before="20" w:after="20"/>
+            </w:pPr>
+            <w:r>
+              <w:rPr>
+                <w:b/>
+                <w:sz w:val="16"/>
+              </w:rPr>
+              <w:t>own: seller is recorded holder</w:t>
+            </w:r>
+          </w:p>
+        </w:tc>
+        <w:tc>
+          <w:tcPr>
+            <w:tcW w:type="dxa" w:w="1984"/>
+            <w:tcBorders>
+              <w:left w:val="nil" w:sz="0" w:color="000000"/>
+              <w:right w:val="nil" w:sz="0" w:color="000000"/>
+              <w:top w:val="single" w:sz="8" w:color="000000"/>
+              <w:bottom w:val="single" w:sz="4" w:color="000000"/>
+            </w:tcBorders>
+          </w:tcPr>
+          <w:p>
+            <w:pPr>
+              <w:keepNext/>
+              <w:spacing w:before="20" w:after="20"/>
+            </w:pPr>
+            <w:r>
+              <w:rPr>
+                <w:b/>
+                <w:sz w:val="16"/>
+              </w:rPr>
+              <w:t>deed: deed registered, matching</w:t>
+            </w:r>
+          </w:p>
+        </w:tc>
+        <w:tc>
+          <w:tcPr>
+            <w:tcW w:type="dxa" w:w="1984"/>
+            <w:tcBorders>
+              <w:left w:val="nil" w:sz="0" w:color="000000"/>
+              <w:right w:val="nil" w:sz="0" w:color="000000"/>
+              <w:top w:val="single" w:sz="8" w:color="000000"/>
+              <w:bottom w:val="single" w:sz="4" w:color="000000"/>
+            </w:tcBorders>
+          </w:tcPr>
+          <w:p>
+            <w:pPr>
+              <w:keepNext/>
+              <w:spacing w:before="20" w:after="20"/>
+            </w:pPr>
+            <w:r>
+              <w:rPr>
+                <w:b/>
+                <w:sz w:val="16"/>
+              </w:rPr>
+              <w:t>restr: no pending proceeding</w:t>
+            </w:r>
+          </w:p>
+        </w:tc>
+      </w:tr>
+      <w:tr>
+        <w:trPr>
+          <w:cantSplit/>
+        </w:trPr>
+        <w:tc>
+          <w:tcPr>
+            <w:tcW w:type="dxa" w:w="964"/>
+            <w:tcBorders>
+              <w:left w:val="nil" w:sz="0" w:color="000000"/>
+              <w:right w:val="nil" w:sz="0" w:color="000000"/>
+              <w:top w:val="nil" w:sz="0" w:color="000000"/>
+              <w:bottom w:val="nil" w:sz="0" w:color="000000"/>
+            </w:tcBorders>
+          </w:tcPr>
+          <w:p>
+            <w:pPr>
+              <w:keepNext/>
+              <w:spacing w:before="20" w:after="20"/>
+            </w:pPr>
+            <w:r>
+              <w:rPr>
+                <w:b w:val="0"/>
+                <w:sz w:val="16"/>
+              </w:rPr>
+              <w:t>Revenue</w:t>
+            </w:r>
+          </w:p>
+        </w:tc>
+        <w:tc>
+          <w:tcPr>
+            <w:tcW w:type="dxa" w:w="1984"/>
+            <w:tcBorders>
+              <w:left w:val="nil" w:sz="0" w:color="000000"/>
+              <w:right w:val="nil" w:sz="0" w:color="000000"/>
+              <w:top w:val="nil" w:sz="0" w:color="000000"/>
+              <w:bottom w:val="nil" w:sz="0" w:color="000000"/>
+            </w:tcBorders>
+          </w:tcPr>
+          <w:p>
+            <w:pPr>
+              <w:keepNext/>
+              <w:spacing w:before="20" w:after="20"/>
+            </w:pPr>
+            <w:r>
+              <w:rPr>
+                <w:b w:val="0"/>
+                <w:sz w:val="16"/>
+              </w:rPr>
+              <w:t>Home. +1 record of rights names the seller; −1 names another</w:t>
+            </w:r>
+          </w:p>
+        </w:tc>
+        <w:tc>
+          <w:tcPr>
+            <w:tcW w:type="dxa" w:w="1984"/>
+            <w:tcBorders>
+              <w:left w:val="nil" w:sz="0" w:color="000000"/>
+              <w:right w:val="nil" w:sz="0" w:color="000000"/>
+              <w:top w:val="nil" w:sz="0" w:color="000000"/>
+              <w:bottom w:val="nil" w:sz="0" w:color="000000"/>
+            </w:tcBorders>
+          </w:tcPr>
+          <w:p>
+            <w:pPr>
+              <w:keepNext/>
+              <w:spacing w:before="20" w:after="20"/>
+            </w:pPr>
+            <w:r>
+              <w:rPr>
+                <w:b w:val="0"/>
+                <w:sz w:val="16"/>
+              </w:rPr>
+              <w:t>+1 mutation file cites a matching deed; −1 no match</w:t>
+            </w:r>
+          </w:p>
+        </w:tc>
+        <w:tc>
+          <w:tcPr>
+            <w:tcW w:type="dxa" w:w="1984"/>
+            <w:tcBorders>
+              <w:left w:val="nil" w:sz="0" w:color="000000"/>
+              <w:right w:val="nil" w:sz="0" w:color="000000"/>
+              <w:top w:val="nil" w:sz="0" w:color="000000"/>
+              <w:bottom w:val="nil" w:sz="0" w:color="000000"/>
+            </w:tcBorders>
+          </w:tcPr>
+          <w:p>
+            <w:pPr>
+              <w:keepNext/>
+              <w:spacing w:before="20" w:after="20"/>
+            </w:pPr>
+            <w:r>
+              <w:rPr>
+                <w:b w:val="0"/>
+                <w:sz w:val="16"/>
+              </w:rPr>
+              <w:t>+1 no pending revenue proceeding noted; −1 one is noted</w:t>
+            </w:r>
+          </w:p>
+        </w:tc>
+      </w:tr>
+      <w:tr>
+        <w:trPr>
+          <w:cantSplit/>
+        </w:trPr>
+        <w:tc>
+          <w:tcPr>
+            <w:tcW w:type="dxa" w:w="964"/>
+            <w:tcBorders>
+              <w:left w:val="nil" w:sz="0" w:color="000000"/>
+              <w:right w:val="nil" w:sz="0" w:color="000000"/>
+              <w:top w:val="nil" w:sz="0" w:color="000000"/>
+              <w:bottom w:val="nil" w:sz="0" w:color="000000"/>
+            </w:tcBorders>
+          </w:tcPr>
+          <w:p>
+            <w:pPr>
+              <w:keepNext/>
+              <w:spacing w:before="20" w:after="20"/>
+            </w:pPr>
+            <w:r>
+              <w:rPr>
+                <w:b w:val="0"/>
+                <w:sz w:val="16"/>
+              </w:rPr>
+              <w:t>Sub-Registrar</w:t>
+            </w:r>
+          </w:p>
+        </w:tc>
+        <w:tc>
+          <w:tcPr>
+            <w:tcW w:type="dxa" w:w="1984"/>
+            <w:tcBorders>
+              <w:left w:val="nil" w:sz="0" w:color="000000"/>
+              <w:right w:val="nil" w:sz="0" w:color="000000"/>
+              <w:top w:val="nil" w:sz="0" w:color="000000"/>
+              <w:bottom w:val="nil" w:sz="0" w:color="000000"/>
+            </w:tcBorders>
+          </w:tcPr>
+          <w:p>
+            <w:pPr>
+              <w:keepNext/>
+              <w:spacing w:before="20" w:after="20"/>
+            </w:pPr>
+            <w:r>
+              <w:rPr>
+                <w:b w:val="0"/>
+                <w:sz w:val="16"/>
+              </w:rPr>
+              <w:t>+1 earlier registered documents consistent with seller; −1 not</w:t>
+            </w:r>
+          </w:p>
+        </w:tc>
+        <w:tc>
+          <w:tcPr>
+            <w:tcW w:type="dxa" w:w="1984"/>
+            <w:tcBorders>
+              <w:left w:val="nil" w:sz="0" w:color="000000"/>
+              <w:right w:val="nil" w:sz="0" w:color="000000"/>
+              <w:top w:val="nil" w:sz="0" w:color="000000"/>
+              <w:bottom w:val="nil" w:sz="0" w:color="000000"/>
+            </w:tcBorders>
+          </w:tcPr>
+          <w:p>
+            <w:pPr>
+              <w:keepNext/>
+              <w:spacing w:before="20" w:after="20"/>
+            </w:pPr>
+            <w:r>
+              <w:rPr>
+                <w:b w:val="0"/>
+                <w:sz w:val="16"/>
+              </w:rPr>
+              <w:t>Home. +1 deed registered, parties and parcel match; −1 not</w:t>
+            </w:r>
+          </w:p>
+        </w:tc>
+        <w:tc>
+          <w:tcPr>
+            <w:tcW w:type="dxa" w:w="1984"/>
+            <w:tcBorders>
+              <w:left w:val="nil" w:sz="0" w:color="000000"/>
+              <w:right w:val="nil" w:sz="0" w:color="000000"/>
+              <w:top w:val="nil" w:sz="0" w:color="000000"/>
+              <w:bottom w:val="nil" w:sz="0" w:color="000000"/>
+            </w:tcBorders>
+          </w:tcPr>
+          <w:p>
+            <w:pPr>
+              <w:keepNext/>
+              <w:spacing w:before="20" w:after="20"/>
+            </w:pPr>
+            <w:r>
+              <w:rPr>
+                <w:b w:val="0"/>
+                <w:sz w:val="16"/>
+              </w:rPr>
+              <w:t>+1 no notice of a pending suit noted; −1 one is noted</w:t>
+            </w:r>
+          </w:p>
+        </w:tc>
+      </w:tr>
+      <w:tr>
+        <w:trPr>
+          <w:cantSplit/>
+        </w:trPr>
+        <w:tc>
+          <w:tcPr>
+            <w:tcW w:type="dxa" w:w="964"/>
+            <w:tcBorders>
+              <w:left w:val="nil" w:sz="0" w:color="000000"/>
+              <w:right w:val="nil" w:sz="0" w:color="000000"/>
+              <w:top w:val="nil" w:sz="0" w:color="000000"/>
+              <w:bottom w:val="single" w:sz="8" w:color="000000"/>
+            </w:tcBorders>
+          </w:tcPr>
+          <w:p>
+            <w:pPr>
+              <w:keepNext w:val="0"/>
+              <w:spacing w:before="20" w:after="20"/>
+            </w:pPr>
+            <w:r>
+              <w:rPr>
+                <w:b w:val="0"/>
+                <w:sz w:val="16"/>
+              </w:rPr>
+              <w:t>Judiciary</w:t>
+            </w:r>
+          </w:p>
+        </w:tc>
+        <w:tc>
+          <w:tcPr>
+            <w:tcW w:type="dxa" w:w="1984"/>
+            <w:tcBorders>
+              <w:left w:val="nil" w:sz="0" w:color="000000"/>
+              <w:right w:val="nil" w:sz="0" w:color="000000"/>
+              <w:top w:val="nil" w:sz="0" w:color="000000"/>
+              <w:bottom w:val="single" w:sz="8" w:color="000000"/>
+            </w:tcBorders>
+          </w:tcPr>
+          <w:p>
+            <w:pPr>
+              <w:keepNext w:val="0"/>
+              <w:spacing w:before="20" w:after="20"/>
+            </w:pPr>
+            <w:r>
+              <w:rPr>
+                <w:b w:val="0"/>
+                <w:sz w:val="16"/>
+              </w:rPr>
+              <w:t>+1 no court record contradicts the holding; −1 a decree names another holder</w:t>
+            </w:r>
+          </w:p>
+        </w:tc>
+        <w:tc>
+          <w:tcPr>
+            <w:tcW w:type="dxa" w:w="1984"/>
+            <w:tcBorders>
+              <w:left w:val="nil" w:sz="0" w:color="000000"/>
+              <w:right w:val="nil" w:sz="0" w:color="000000"/>
+              <w:top w:val="nil" w:sz="0" w:color="000000"/>
+              <w:bottom w:val="single" w:sz="8" w:color="000000"/>
+            </w:tcBorders>
+          </w:tcPr>
+          <w:p>
+            <w:pPr>
+              <w:keepNext w:val="0"/>
+              <w:spacing w:before="20" w:after="20"/>
+            </w:pPr>
+            <w:r>
+              <w:rPr>
+                <w:b w:val="0"/>
+                <w:sz w:val="16"/>
+              </w:rPr>
+              <w:t>+1 no case challenges the deed; −1 one does</w:t>
+            </w:r>
+          </w:p>
+        </w:tc>
+        <w:tc>
+          <w:tcPr>
+            <w:tcW w:type="dxa" w:w="1984"/>
+            <w:tcBorders>
+              <w:left w:val="nil" w:sz="0" w:color="000000"/>
+              <w:right w:val="nil" w:sz="0" w:color="000000"/>
+              <w:top w:val="nil" w:sz="0" w:color="000000"/>
+              <w:bottom w:val="single" w:sz="8" w:color="000000"/>
+            </w:tcBorders>
+          </w:tcPr>
+          <w:p>
+            <w:pPr>
+              <w:keepNext w:val="0"/>
+              <w:spacing w:before="20" w:after="20"/>
+            </w:pPr>
+            <w:r>
+              <w:rPr>
+                <w:b w:val="0"/>
+                <w:sz w:val="16"/>
+              </w:rPr>
+              <w:t>Home. +1 nothing pending in any forum covered; −1 a proceeding is pending</w:t>
+            </w:r>
+          </w:p>
+        </w:tc>
+      </w:tr>
+    </w:tbl>
+    <w:p>
+      <w:pPr>
+        <w:spacing w:before="40"/>
+      </w:pPr>
+      <w:r>
+        <w:rPr>
+          <w:b w:val="0"/>
+          <w:sz w:val="14"/>
+        </w:rPr>
+        <w:t>Simulated signals only; not claims about the records real offices hold or certify.</w:t>
+      </w:r>
+    </w:p>
+    <w:p>
+      <w:pPr>
+        <w:keepNext/>
+        <w:spacing w:before="240" w:after="80"/>
+        <w:jc w:val="center"/>
+      </w:pPr>
+      <w:r>
+        <w:rPr>
+          <w:b/>
+          <w:sz w:val="18"/>
+        </w:rPr>
+        <w:t xml:space="preserve">Table S2. </w:t>
+      </w:r>
+      <w:r>
+        <w:rPr>
+          <w:b w:val="0"/>
+          <w:sz w:val="18"/>
+        </w:rPr>
+        <w:t>Exploratory coverage-gate ablation A1 (paired 95% CIs, 100 seeds, percentage points)</w:t>
+      </w:r>
+    </w:p>
+    <w:tbl>
+      <w:tblPr>
+        <w:tblW w:type="auto" w:w="0"/>
+        <w:jc w:val="center"/>
+        <w:tblLayout w:type="fixed"/>
+        <w:tblLook w:firstColumn="1" w:firstRow="1" w:lastColumn="0" w:lastRow="0" w:noHBand="0" w:noVBand="1" w:val="04A0"/>
+      </w:tblPr>
+      <w:tblGrid>
+        <w:gridCol w:w="2948"/>
+        <w:gridCol w:w="794"/>
+        <w:gridCol w:w="1587"/>
+        <w:gridCol w:w="1587"/>
+      </w:tblGrid>
+      <w:tr>
+        <w:trPr>
+          <w:cantSplit/>
+          <w:tblHeader/>
+        </w:trPr>
+        <w:tc>
+          <w:tcPr>
+            <w:tcW w:type="dxa" w:w="2948"/>
+            <w:tcBorders>
+              <w:left w:val="nil" w:sz="0" w:color="000000"/>
+              <w:right w:val="nil" w:sz="0" w:color="000000"/>
+              <w:top w:val="single" w:sz="8" w:color="000000"/>
+              <w:bottom w:val="single" w:sz="4" w:color="000000"/>
+            </w:tcBorders>
+          </w:tcPr>
+          <w:p>
+            <w:pPr>
+              <w:keepNext/>
+              <w:spacing w:before="20" w:after="20"/>
+            </w:pPr>
+            <w:r>
+              <w:rPr>
+                <w:b/>
+                <w:sz w:val="16"/>
+              </w:rPr>
+              <w:t>Comparison</w:t>
+            </w:r>
+          </w:p>
+        </w:tc>
+        <w:tc>
+          <w:tcPr>
+            <w:tcW w:type="dxa" w:w="794"/>
+            <w:tcBorders>
+              <w:left w:val="nil" w:sz="0" w:color="000000"/>
+              <w:right w:val="nil" w:sz="0" w:color="000000"/>
+              <w:top w:val="single" w:sz="8" w:color="000000"/>
+              <w:bottom w:val="single" w:sz="4" w:color="000000"/>
+            </w:tcBorders>
+          </w:tcPr>
+          <w:p>
+            <w:pPr>
+              <w:keepNext/>
+              <w:spacing w:before="20" w:after="20"/>
+            </w:pPr>
+            <w:r>
+              <w:rPr>
+                <w:b/>
+                <w:sz w:val="16"/>
+              </w:rPr>
+              <w:t>Scenario</w:t>
+            </w:r>
+          </w:p>
+        </w:tc>
+        <w:tc>
+          <w:tcPr>
+            <w:tcW w:type="dxa" w:w="1587"/>
+            <w:tcBorders>
+              <w:left w:val="nil" w:sz="0" w:color="000000"/>
+              <w:right w:val="nil" w:sz="0" w:color="000000"/>
+              <w:top w:val="single" w:sz="8" w:color="000000"/>
+              <w:bottom w:val="single" w:sz="4" w:color="000000"/>
+            </w:tcBorders>
+          </w:tcPr>
+          <w:p>
+            <w:pPr>
+              <w:keepNext/>
+              <w:spacing w:before="20" w:after="20"/>
+            </w:pPr>
+            <w:r>
+              <w:rPr>
+                <w:b/>
+                <w:sz w:val="16"/>
+              </w:rPr>
+              <w:t>FCR difference</w:t>
+            </w:r>
+          </w:p>
+        </w:tc>
+        <w:tc>
+          <w:tcPr>
+            <w:tcW w:type="dxa" w:w="1587"/>
+            <w:tcBorders>
+              <w:left w:val="nil" w:sz="0" w:color="000000"/>
+              <w:right w:val="nil" w:sz="0" w:color="000000"/>
+              <w:top w:val="single" w:sz="8" w:color="000000"/>
+              <w:bottom w:val="single" w:sz="4" w:color="000000"/>
+            </w:tcBorders>
+          </w:tcPr>
+          <w:p>
+            <w:pPr>
+              <w:keepNext/>
+              <w:spacing w:before="20" w:after="20"/>
+            </w:pPr>
+            <w:r>
+              <w:rPr>
+                <w:b/>
+                <w:sz w:val="16"/>
+              </w:rPr>
+              <w:t>VCC difference</w:t>
+            </w:r>
+          </w:p>
+        </w:tc>
+      </w:tr>
+      <w:tr>
+        <w:trPr>
+          <w:cantSplit/>
+        </w:trPr>
+        <w:tc>
+          <w:tcPr>
+            <w:tcW w:type="dxa" w:w="2948"/>
+            <w:tcBorders>
+              <w:left w:val="nil" w:sz="0" w:color="000000"/>
+              <w:right w:val="nil" w:sz="0" w:color="000000"/>
+              <w:top w:val="nil" w:sz="0" w:color="000000"/>
+              <w:bottom w:val="nil" w:sz="0" w:color="000000"/>
+            </w:tcBorders>
+          </w:tcPr>
+          <w:p>
+            <w:pPr>
+              <w:keepNext/>
+              <w:spacing w:before="20" w:after="20"/>
+            </w:pPr>
+            <w:r>
+              <w:rPr>
+                <w:b w:val="0"/>
+                <w:sz w:val="16"/>
+              </w:rPr>
+              <w:t>Hybrid − majority, no gate (G0)</w:t>
+            </w:r>
+          </w:p>
+        </w:tc>
+        <w:tc>
+          <w:tcPr>
+            <w:tcW w:type="dxa" w:w="794"/>
+            <w:tcBorders>
+              <w:left w:val="nil" w:sz="0" w:color="000000"/>
+              <w:right w:val="nil" w:sz="0" w:color="000000"/>
+              <w:top w:val="nil" w:sz="0" w:color="000000"/>
+              <w:bottom w:val="nil" w:sz="0" w:color="000000"/>
+            </w:tcBorders>
+          </w:tcPr>
+          <w:p>
+            <w:pPr>
+              <w:keepNext/>
+              <w:spacing w:before="20" w:after="20"/>
+            </w:pPr>
+            <w:r>
+              <w:rPr>
+                <w:b w:val="0"/>
+                <w:sz w:val="16"/>
+              </w:rPr>
+              <w:t>S1</w:t>
+            </w:r>
+          </w:p>
+        </w:tc>
+        <w:tc>
+          <w:tcPr>
+            <w:tcW w:type="dxa" w:w="1587"/>
+            <w:tcBorders>
+              <w:left w:val="nil" w:sz="0" w:color="000000"/>
+              <w:right w:val="nil" w:sz="0" w:color="000000"/>
+              <w:top w:val="nil" w:sz="0" w:color="000000"/>
+              <w:bottom w:val="nil" w:sz="0" w:color="000000"/>
+            </w:tcBorders>
+          </w:tcPr>
+          <w:p>
+            <w:pPr>
+              <w:keepNext/>
+              <w:spacing w:before="20" w:after="20"/>
+            </w:pPr>
+            <w:r>
+              <w:rPr>
+                <w:b w:val="0"/>
+                <w:sz w:val="16"/>
+              </w:rPr>
+              <w:t>−1.85 [−2.00, −1.69]</w:t>
+            </w:r>
+          </w:p>
+        </w:tc>
+        <w:tc>
+          <w:tcPr>
+            <w:tcW w:type="dxa" w:w="1587"/>
+            <w:tcBorders>
+              <w:left w:val="nil" w:sz="0" w:color="000000"/>
+              <w:right w:val="nil" w:sz="0" w:color="000000"/>
+              <w:top w:val="nil" w:sz="0" w:color="000000"/>
+              <w:bottom w:val="nil" w:sz="0" w:color="000000"/>
+            </w:tcBorders>
+          </w:tcPr>
+          <w:p>
+            <w:pPr>
+              <w:keepNext/>
+              <w:spacing w:before="20" w:after="20"/>
+            </w:pPr>
+            <w:r>
+              <w:rPr>
+                <w:b w:val="0"/>
+                <w:sz w:val="16"/>
+              </w:rPr>
+              <w:t>−0.27 [−0.53, −0.004]</w:t>
+            </w:r>
+          </w:p>
+        </w:tc>
+      </w:tr>
+      <w:tr>
+        <w:trPr>
+          <w:cantSplit/>
+        </w:trPr>
+        <w:tc>
+          <w:tcPr>
+            <w:tcW w:type="dxa" w:w="2948"/>
+            <w:tcBorders>
+              <w:left w:val="nil" w:sz="0" w:color="000000"/>
+              <w:right w:val="nil" w:sz="0" w:color="000000"/>
+              <w:top w:val="nil" w:sz="0" w:color="000000"/>
+              <w:bottom w:val="nil" w:sz="0" w:color="000000"/>
+            </w:tcBorders>
+          </w:tcPr>
+          <w:p>
+            <w:pPr>
+              <w:keepNext/>
+              <w:spacing w:before="20" w:after="20"/>
+            </w:pPr>
+            <w:r>
+              <w:rPr>
+                <w:b w:val="0"/>
+                <w:sz w:val="16"/>
+              </w:rPr>
+              <w:t>Hybrid − majority, no gate (G0)</w:t>
+            </w:r>
+          </w:p>
+        </w:tc>
+        <w:tc>
+          <w:tcPr>
+            <w:tcW w:type="dxa" w:w="794"/>
+            <w:tcBorders>
+              <w:left w:val="nil" w:sz="0" w:color="000000"/>
+              <w:right w:val="nil" w:sz="0" w:color="000000"/>
+              <w:top w:val="nil" w:sz="0" w:color="000000"/>
+              <w:bottom w:val="nil" w:sz="0" w:color="000000"/>
+            </w:tcBorders>
+          </w:tcPr>
+          <w:p>
+            <w:pPr>
+              <w:keepNext/>
+              <w:spacing w:before="20" w:after="20"/>
+            </w:pPr>
+            <w:r>
+              <w:rPr>
+                <w:b w:val="0"/>
+                <w:sz w:val="16"/>
+              </w:rPr>
+              <w:t>S4</w:t>
+            </w:r>
+          </w:p>
+        </w:tc>
+        <w:tc>
+          <w:tcPr>
+            <w:tcW w:type="dxa" w:w="1587"/>
+            <w:tcBorders>
+              <w:left w:val="nil" w:sz="0" w:color="000000"/>
+              <w:right w:val="nil" w:sz="0" w:color="000000"/>
+              <w:top w:val="nil" w:sz="0" w:color="000000"/>
+              <w:bottom w:val="nil" w:sz="0" w:color="000000"/>
+            </w:tcBorders>
+          </w:tcPr>
+          <w:p>
+            <w:pPr>
+              <w:keepNext/>
+              <w:spacing w:before="20" w:after="20"/>
+            </w:pPr>
+            <w:r>
+              <w:rPr>
+                <w:b w:val="0"/>
+                <w:sz w:val="16"/>
+              </w:rPr>
+              <w:t>−0.99 [−1.14, −0.83]</w:t>
+            </w:r>
+          </w:p>
+        </w:tc>
+        <w:tc>
+          <w:tcPr>
+            <w:tcW w:type="dxa" w:w="1587"/>
+            <w:tcBorders>
+              <w:left w:val="nil" w:sz="0" w:color="000000"/>
+              <w:right w:val="nil" w:sz="0" w:color="000000"/>
+              <w:top w:val="nil" w:sz="0" w:color="000000"/>
+              <w:bottom w:val="nil" w:sz="0" w:color="000000"/>
+            </w:tcBorders>
+          </w:tcPr>
+          <w:p>
+            <w:pPr>
+              <w:keepNext/>
+              <w:spacing w:before="20" w:after="20"/>
+            </w:pPr>
+            <w:r>
+              <w:rPr>
+                <w:b w:val="0"/>
+                <w:sz w:val="16"/>
+              </w:rPr>
+              <w:t>+8.41 [+8.13, +8.70]</w:t>
+            </w:r>
+          </w:p>
+        </w:tc>
+      </w:tr>
+      <w:tr>
+        <w:trPr>
+          <w:cantSplit/>
+        </w:trPr>
+        <w:tc>
+          <w:tcPr>
+            <w:tcW w:type="dxa" w:w="2948"/>
+            <w:tcBorders>
+              <w:left w:val="nil" w:sz="0" w:color="000000"/>
+              <w:right w:val="nil" w:sz="0" w:color="000000"/>
+              <w:top w:val="nil" w:sz="0" w:color="000000"/>
+              <w:bottom w:val="nil" w:sz="0" w:color="000000"/>
+            </w:tcBorders>
+          </w:tcPr>
+          <w:p>
+            <w:pPr>
+              <w:keepNext/>
+              <w:spacing w:before="20" w:after="20"/>
+            </w:pPr>
+            <w:r>
+              <w:rPr>
+                <w:b w:val="0"/>
+                <w:sz w:val="16"/>
+              </w:rPr>
+              <w:t>Hybrid − majority, common count gate (G1)</w:t>
+            </w:r>
+          </w:p>
+        </w:tc>
+        <w:tc>
+          <w:tcPr>
+            <w:tcW w:type="dxa" w:w="794"/>
+            <w:tcBorders>
+              <w:left w:val="nil" w:sz="0" w:color="000000"/>
+              <w:right w:val="nil" w:sz="0" w:color="000000"/>
+              <w:top w:val="nil" w:sz="0" w:color="000000"/>
+              <w:bottom w:val="nil" w:sz="0" w:color="000000"/>
+            </w:tcBorders>
+          </w:tcPr>
+          <w:p>
+            <w:pPr>
+              <w:keepNext/>
+              <w:spacing w:before="20" w:after="20"/>
+            </w:pPr>
+            <w:r>
+              <w:rPr>
+                <w:b w:val="0"/>
+                <w:sz w:val="16"/>
+              </w:rPr>
+              <w:t>S1</w:t>
+            </w:r>
+          </w:p>
+        </w:tc>
+        <w:tc>
+          <w:tcPr>
+            <w:tcW w:type="dxa" w:w="1587"/>
+            <w:tcBorders>
+              <w:left w:val="nil" w:sz="0" w:color="000000"/>
+              <w:right w:val="nil" w:sz="0" w:color="000000"/>
+              <w:top w:val="nil" w:sz="0" w:color="000000"/>
+              <w:bottom w:val="nil" w:sz="0" w:color="000000"/>
+            </w:tcBorders>
+          </w:tcPr>
+          <w:p>
+            <w:pPr>
+              <w:keepNext/>
+              <w:spacing w:before="20" w:after="20"/>
+            </w:pPr>
+            <w:r>
+              <w:rPr>
+                <w:b w:val="0"/>
+                <w:sz w:val="16"/>
+              </w:rPr>
+              <w:t>−1.85 [−2.01, −1.70]</w:t>
+            </w:r>
+          </w:p>
+        </w:tc>
+        <w:tc>
+          <w:tcPr>
+            <w:tcW w:type="dxa" w:w="1587"/>
+            <w:tcBorders>
+              <w:left w:val="nil" w:sz="0" w:color="000000"/>
+              <w:right w:val="nil" w:sz="0" w:color="000000"/>
+              <w:top w:val="nil" w:sz="0" w:color="000000"/>
+              <w:bottom w:val="nil" w:sz="0" w:color="000000"/>
+            </w:tcBorders>
+          </w:tcPr>
+          <w:p>
+            <w:pPr>
+              <w:keepNext/>
+              <w:spacing w:before="20" w:after="20"/>
+            </w:pPr>
+            <w:r>
+              <w:rPr>
+                <w:b w:val="0"/>
+                <w:sz w:val="16"/>
+              </w:rPr>
+              <w:t>−0.27 [−0.53, −0.004]</w:t>
+            </w:r>
+          </w:p>
+        </w:tc>
+      </w:tr>
+      <w:tr>
+        <w:trPr>
+          <w:cantSplit/>
+        </w:trPr>
+        <w:tc>
+          <w:tcPr>
+            <w:tcW w:type="dxa" w:w="2948"/>
+            <w:tcBorders>
+              <w:left w:val="nil" w:sz="0" w:color="000000"/>
+              <w:right w:val="nil" w:sz="0" w:color="000000"/>
+              <w:top w:val="nil" w:sz="0" w:color="000000"/>
+              <w:bottom w:val="nil" w:sz="0" w:color="000000"/>
+            </w:tcBorders>
+          </w:tcPr>
+          <w:p>
+            <w:pPr>
+              <w:keepNext/>
+              <w:spacing w:before="20" w:after="20"/>
+            </w:pPr>
+            <w:r>
+              <w:rPr>
+                <w:b w:val="0"/>
+                <w:sz w:val="16"/>
+              </w:rPr>
+              <w:t>Hybrid − majority, common count gate (G1)</w:t>
+            </w:r>
+          </w:p>
+        </w:tc>
+        <w:tc>
+          <w:tcPr>
+            <w:tcW w:type="dxa" w:w="794"/>
+            <w:tcBorders>
+              <w:left w:val="nil" w:sz="0" w:color="000000"/>
+              <w:right w:val="nil" w:sz="0" w:color="000000"/>
+              <w:top w:val="nil" w:sz="0" w:color="000000"/>
+              <w:bottom w:val="nil" w:sz="0" w:color="000000"/>
+            </w:tcBorders>
+          </w:tcPr>
+          <w:p>
+            <w:pPr>
+              <w:keepNext/>
+              <w:spacing w:before="20" w:after="20"/>
+            </w:pPr>
+            <w:r>
+              <w:rPr>
+                <w:b w:val="0"/>
+                <w:sz w:val="16"/>
+              </w:rPr>
+              <w:t>S4</w:t>
+            </w:r>
+          </w:p>
+        </w:tc>
+        <w:tc>
+          <w:tcPr>
+            <w:tcW w:type="dxa" w:w="1587"/>
+            <w:tcBorders>
+              <w:left w:val="nil" w:sz="0" w:color="000000"/>
+              <w:right w:val="nil" w:sz="0" w:color="000000"/>
+              <w:top w:val="nil" w:sz="0" w:color="000000"/>
+              <w:bottom w:val="nil" w:sz="0" w:color="000000"/>
+            </w:tcBorders>
+          </w:tcPr>
+          <w:p>
+            <w:pPr>
+              <w:keepNext/>
+              <w:spacing w:before="20" w:after="20"/>
+            </w:pPr>
+            <w:r>
+              <w:rPr>
+                <w:b w:val="0"/>
+                <w:sz w:val="16"/>
+              </w:rPr>
+              <w:t>−1.01 [−1.19, −0.83]</w:t>
+            </w:r>
+          </w:p>
+        </w:tc>
+        <w:tc>
+          <w:tcPr>
+            <w:tcW w:type="dxa" w:w="1587"/>
+            <w:tcBorders>
+              <w:left w:val="nil" w:sz="0" w:color="000000"/>
+              <w:right w:val="nil" w:sz="0" w:color="000000"/>
+              <w:top w:val="nil" w:sz="0" w:color="000000"/>
+              <w:bottom w:val="nil" w:sz="0" w:color="000000"/>
+            </w:tcBorders>
+          </w:tcPr>
+          <w:p>
+            <w:pPr>
+              <w:keepNext/>
+              <w:spacing w:before="20" w:after="20"/>
+            </w:pPr>
+            <w:r>
+              <w:rPr>
+                <w:b w:val="0"/>
+                <w:sz w:val="16"/>
+              </w:rPr>
+              <w:t>+8.41 [+8.13, +8.70]</w:t>
+            </w:r>
+          </w:p>
+        </w:tc>
+      </w:tr>
+      <w:tr>
+        <w:trPr>
+          <w:cantSplit/>
+        </w:trPr>
+        <w:tc>
+          <w:tcPr>
+            <w:tcW w:type="dxa" w:w="2948"/>
+            <w:tcBorders>
+              <w:left w:val="nil" w:sz="0" w:color="000000"/>
+              <w:right w:val="nil" w:sz="0" w:color="000000"/>
+              <w:top w:val="nil" w:sz="0" w:color="000000"/>
+              <w:bottom w:val="nil" w:sz="0" w:color="000000"/>
+            </w:tcBorders>
+          </w:tcPr>
+          <w:p>
+            <w:pPr>
+              <w:keepNext/>
+              <w:spacing w:before="20" w:after="20"/>
+            </w:pPr>
+            <w:r>
+              <w:rPr>
+                <w:b w:val="0"/>
+                <w:sz w:val="16"/>
+              </w:rPr>
+              <w:t>Hybrid: weighted gate − count gate</w:t>
+            </w:r>
+          </w:p>
+        </w:tc>
+        <w:tc>
+          <w:tcPr>
+            <w:tcW w:type="dxa" w:w="794"/>
+            <w:tcBorders>
+              <w:left w:val="nil" w:sz="0" w:color="000000"/>
+              <w:right w:val="nil" w:sz="0" w:color="000000"/>
+              <w:top w:val="nil" w:sz="0" w:color="000000"/>
+              <w:bottom w:val="nil" w:sz="0" w:color="000000"/>
+            </w:tcBorders>
+          </w:tcPr>
+          <w:p>
+            <w:pPr>
+              <w:keepNext/>
+              <w:spacing w:before="20" w:after="20"/>
+            </w:pPr>
+            <w:r>
+              <w:rPr>
+                <w:b w:val="0"/>
+                <w:sz w:val="16"/>
+              </w:rPr>
+              <w:t>S1</w:t>
+            </w:r>
+          </w:p>
+        </w:tc>
+        <w:tc>
+          <w:tcPr>
+            <w:tcW w:type="dxa" w:w="1587"/>
+            <w:tcBorders>
+              <w:left w:val="nil" w:sz="0" w:color="000000"/>
+              <w:right w:val="nil" w:sz="0" w:color="000000"/>
+              <w:top w:val="nil" w:sz="0" w:color="000000"/>
+              <w:bottom w:val="nil" w:sz="0" w:color="000000"/>
+            </w:tcBorders>
+          </w:tcPr>
+          <w:p>
+            <w:pPr>
+              <w:keepNext/>
+              <w:spacing w:before="20" w:after="20"/>
+            </w:pPr>
+            <w:r>
+              <w:rPr>
+                <w:b w:val="0"/>
+                <w:sz w:val="16"/>
+              </w:rPr>
+              <w:t>−0.11 [−0.15, −0.07]</w:t>
+            </w:r>
+          </w:p>
+        </w:tc>
+        <w:tc>
+          <w:tcPr>
+            <w:tcW w:type="dxa" w:w="1587"/>
+            <w:tcBorders>
+              <w:left w:val="nil" w:sz="0" w:color="000000"/>
+              <w:right w:val="nil" w:sz="0" w:color="000000"/>
+              <w:top w:val="nil" w:sz="0" w:color="000000"/>
+              <w:bottom w:val="nil" w:sz="0" w:color="000000"/>
+            </w:tcBorders>
+          </w:tcPr>
+          <w:p>
+            <w:pPr>
+              <w:keepNext/>
+              <w:spacing w:before="20" w:after="20"/>
+            </w:pPr>
+            <w:r>
+              <w:rPr>
+                <w:b w:val="0"/>
+                <w:sz w:val="16"/>
+              </w:rPr>
+              <w:t>−4.25 [−4.39, −4.11]</w:t>
+            </w:r>
+          </w:p>
+        </w:tc>
+      </w:tr>
+      <w:tr>
+        <w:trPr>
+          <w:cantSplit/>
+        </w:trPr>
+        <w:tc>
+          <w:tcPr>
+            <w:tcW w:type="dxa" w:w="2948"/>
+            <w:tcBorders>
+              <w:left w:val="nil" w:sz="0" w:color="000000"/>
+              <w:right w:val="nil" w:sz="0" w:color="000000"/>
+              <w:top w:val="nil" w:sz="0" w:color="000000"/>
+              <w:bottom w:val="single" w:sz="8" w:color="000000"/>
+            </w:tcBorders>
+          </w:tcPr>
+          <w:p>
+            <w:pPr>
+              <w:keepNext w:val="0"/>
+              <w:spacing w:before="20" w:after="20"/>
+            </w:pPr>
+            <w:r>
+              <w:rPr>
+                <w:b w:val="0"/>
+                <w:sz w:val="16"/>
+              </w:rPr>
+              <w:t>Hybrid: weighted gate − count gate</w:t>
+            </w:r>
+          </w:p>
+        </w:tc>
+        <w:tc>
+          <w:tcPr>
+            <w:tcW w:type="dxa" w:w="794"/>
+            <w:tcBorders>
+              <w:left w:val="nil" w:sz="0" w:color="000000"/>
+              <w:right w:val="nil" w:sz="0" w:color="000000"/>
+              <w:top w:val="nil" w:sz="0" w:color="000000"/>
+              <w:bottom w:val="single" w:sz="8" w:color="000000"/>
+            </w:tcBorders>
+          </w:tcPr>
+          <w:p>
+            <w:pPr>
+              <w:keepNext w:val="0"/>
+              <w:spacing w:before="20" w:after="20"/>
+            </w:pPr>
+            <w:r>
+              <w:rPr>
+                <w:b w:val="0"/>
+                <w:sz w:val="16"/>
+              </w:rPr>
+              <w:t>S4</w:t>
+            </w:r>
+          </w:p>
+        </w:tc>
+        <w:tc>
+          <w:tcPr>
+            <w:tcW w:type="dxa" w:w="1587"/>
+            <w:tcBorders>
+              <w:left w:val="nil" w:sz="0" w:color="000000"/>
+              <w:right w:val="nil" w:sz="0" w:color="000000"/>
+              <w:top w:val="nil" w:sz="0" w:color="000000"/>
+              <w:bottom w:val="single" w:sz="8" w:color="000000"/>
+            </w:tcBorders>
+          </w:tcPr>
+          <w:p>
+            <w:pPr>
+              <w:keepNext w:val="0"/>
+              <w:spacing w:before="20" w:after="20"/>
+            </w:pPr>
+            <w:r>
+              <w:rPr>
+                <w:b w:val="0"/>
+                <w:sz w:val="16"/>
+              </w:rPr>
+              <w:t>−0.72 [−0.85, −0.60]</w:t>
+            </w:r>
+          </w:p>
+        </w:tc>
+        <w:tc>
+          <w:tcPr>
+            <w:tcW w:type="dxa" w:w="1587"/>
+            <w:tcBorders>
+              <w:left w:val="nil" w:sz="0" w:color="000000"/>
+              <w:right w:val="nil" w:sz="0" w:color="000000"/>
+              <w:top w:val="nil" w:sz="0" w:color="000000"/>
+              <w:bottom w:val="single" w:sz="8" w:color="000000"/>
+            </w:tcBorders>
+          </w:tcPr>
+          <w:p>
+            <w:pPr>
+              <w:keepNext w:val="0"/>
+              <w:spacing w:before="20" w:after="20"/>
+            </w:pPr>
+            <w:r>
+              <w:rPr>
+                <w:b w:val="0"/>
+                <w:sz w:val="16"/>
+              </w:rPr>
+              <w:t>−21.23 [−21.52, −20.95]</w:t>
+            </w:r>
+          </w:p>
+        </w:tc>
+      </w:tr>
+    </w:tbl>
+    <w:p>
+      <w:pPr>
+        <w:keepNext/>
+        <w:spacing w:before="240" w:after="80"/>
+        <w:jc w:val="center"/>
+      </w:pPr>
+      <w:r>
+        <w:rPr>
+          <w:b/>
+          <w:sz w:val="18"/>
+        </w:rPr>
+        <w:t xml:space="preserve">Table S3. </w:t>
       </w:r>
       <w:r>
         <w:rPr>
@@ -9763,7 +9771,7 @@
                 <w:b w:val="0"/>
                 <w:sz w:val="16"/>
               </w:rPr>
-              <w:t xml:space="preserve">Tables 7–8; Figs. 2–3; </w:t>
+              <w:t xml:space="preserve">Tables 6–7; Fig. 2; Fig. S1; </w:t>
             </w:r>
             <w:r>
               <w:rPr>
@@ -9811,7 +9819,7 @@
                 <w:b w:val="0"/>
                 <w:sz w:val="16"/>
               </w:rPr>
-              <w:t>Pre-specified (frozen protocol); five analysis choices in Table 12</w:t>
+              <w:t>Pre-specified (frozen protocol); five analysis choices in Table S4</w:t>
             </w:r>
           </w:p>
         </w:tc>
@@ -9999,7 +10007,7 @@
                 <w:b w:val="0"/>
                 <w:sz w:val="16"/>
               </w:rPr>
-              <w:t>Table 9 (A1); Table 10 and Fig. 4 (A2)</w:t>
+              <w:t>Table S2 (A1); Table 8 and Fig. 3 (A2)</w:t>
             </w:r>
           </w:p>
         </w:tc>
@@ -10040,7 +10048,7 @@
           <w:b/>
           <w:sz w:val="18"/>
         </w:rPr>
-        <w:t xml:space="preserve">Table 12. </w:t>
+        <w:t xml:space="preserve">Table S4. </w:t>
       </w:r>
       <w:r>
         <w:rPr>

</xml_diff>